<commit_message>
chore: 更新6月30日预测 + CLAUDE.md规则 + 淘汰赛分析 + gitignore完善
Co-Authored-By: Claude Opus 4.8 (1M context) <noreply@anthropic.com>
</commit_message>
<xml_diff>
--- a/2026年6月30日_3场预测.docx
+++ b/2026年6月30日_3场预测.docx
@@ -1594,7 +1594,7 @@
                 <w:rFonts w:ascii="微软雅黑" w:hAnsi="微软雅黑" w:eastAsia="微软雅黑"/>
                 <w:sz w:val="18"/>
               </w:rPr>
-              <w:t>胜</w:t>
+              <w:t>4-0</w:t>
             </w:r>
           </w:p>
         </w:tc>
@@ -1613,7 +1613,7 @@
                 <w:rFonts w:ascii="微软雅黑" w:hAnsi="微软雅黑" w:eastAsia="微软雅黑"/>
                 <w:sz w:val="18"/>
               </w:rPr>
-              <w:t>小组赛第二场</w:t>
+              <w:t>镰田大地4'闪击+上田绮世梅开二度+伊东纯也</w:t>
             </w:r>
           </w:p>
         </w:tc>
@@ -3911,7 +3911,7 @@
                 <w:rFonts w:ascii="微软雅黑" w:hAnsi="微软雅黑" w:eastAsia="微软雅黑"/>
                 <w:sz w:val="18"/>
               </w:rPr>
-              <w:t>负</w:t>
+              <w:t>1-4</w:t>
             </w:r>
           </w:p>
         </w:tc>
@@ -3931,7 +3931,7 @@
                 <w:rFonts w:ascii="微软雅黑" w:hAnsi="微软雅黑" w:eastAsia="微软雅黑"/>
                 <w:sz w:val="18"/>
               </w:rPr>
-              <w:t>小组赛揭幕战</w:t>
+              <w:t>7分钟乌龙→半场0-3→防线崩溃</w:t>
             </w:r>
           </w:p>
         </w:tc>
@@ -6059,7 +6059,7 @@
                 <w:rFonts w:ascii="微软雅黑" w:hAnsi="微软雅黑" w:eastAsia="微软雅黑"/>
                 <w:sz w:val="18"/>
               </w:rPr>
-              <w:t>胜</w:t>
+              <w:t>5-1</w:t>
             </w:r>
           </w:p>
         </w:tc>
@@ -6078,7 +6078,7 @@
                 <w:rFonts w:ascii="微软雅黑" w:hAnsi="微软雅黑" w:eastAsia="微软雅黑"/>
                 <w:sz w:val="18"/>
               </w:rPr>
-              <w:t>小组赛第二场</w:t>
+              <w:t>哈克波+邓弗里斯主导, 瑞典防线被打穿</w:t>
             </w:r>
           </w:p>
         </w:tc>
@@ -6139,7 +6139,7 @@
                 <w:rFonts w:ascii="微软雅黑" w:hAnsi="微软雅黑" w:eastAsia="微软雅黑"/>
                 <w:sz w:val="18"/>
               </w:rPr>
-              <w:t>胜</w:t>
+              <w:t>3-1</w:t>
             </w:r>
           </w:p>
         </w:tc>
@@ -6159,7 +6159,7 @@
                 <w:rFonts w:ascii="微软雅黑" w:hAnsi="微软雅黑" w:eastAsia="微软雅黑"/>
                 <w:sz w:val="18"/>
               </w:rPr>
-              <w:t>小组赛第三场</w:t>
+              <w:t>布罗比7'破门, 突尼斯仅角球得1分</w:t>
             </w:r>
           </w:p>
         </w:tc>

</xml_diff>